<commit_message>
Add arquivos apresentação e conteúdo do código do sensor
</commit_message>
<xml_diff>
--- a/electrical-diagrams/esquematico-com-front.docx
+++ b/electrical-diagrams/esquematico-com-front.docx
@@ -156,10 +156,10 @@
         </w:rPr>
         <w:lastRenderedPageBreak/>
         <w:drawing>
-          <wp:inline distT="0" distB="0" distL="0" distR="0" wp14:anchorId="0E6E961D" wp14:editId="4C283FDB">
-            <wp:extent cx="8892540" cy="5219700"/>
-            <wp:effectExtent l="0" t="0" r="3810" b="0"/>
-            <wp:docPr id="1872264996" name="Imagem 1"/>
+          <wp:inline distT="0" distB="0" distL="0" distR="0" wp14:anchorId="710BAA9A" wp14:editId="071D3793">
+            <wp:extent cx="8892540" cy="5001895"/>
+            <wp:effectExtent l="0" t="0" r="3810" b="8255"/>
+            <wp:docPr id="816656377" name="Imagem 1"/>
             <wp:cNvGraphicFramePr>
               <a:graphicFrameLocks xmlns:a="http://schemas.openxmlformats.org/drawingml/2006/main" noChangeAspect="1"/>
             </wp:cNvGraphicFramePr>
@@ -167,7 +167,7 @@
               <a:graphicData uri="http://schemas.openxmlformats.org/drawingml/2006/picture">
                 <pic:pic xmlns:pic="http://schemas.openxmlformats.org/drawingml/2006/picture">
                   <pic:nvPicPr>
-                    <pic:cNvPr id="1872264996" name=""/>
+                    <pic:cNvPr id="816656377" name=""/>
                     <pic:cNvPicPr/>
                   </pic:nvPicPr>
                   <pic:blipFill>
@@ -179,7 +179,7 @@
                   <pic:spPr>
                     <a:xfrm>
                       <a:off x="0" y="0"/>
-                      <a:ext cx="8892540" cy="5219700"/>
+                      <a:ext cx="8892540" cy="5001895"/>
                     </a:xfrm>
                     <a:prstGeom prst="rect">
                       <a:avLst/>

</xml_diff>